<commit_message>
Update report and README
Co-Authored-By: Claude Opus 5.5 <noreply@anthropic.com>
</commit_message>
<xml_diff>
--- a/report/PA1_report.docx
+++ b/report/PA1_report.docx
@@ -55,7 +55,7 @@
           <w:color w:val="52514E"/>
           <w:sz w:val="18"/>
         </w:rPr>
-        <w:t xml:space="preserve"> are supplementary: they come from extra_experiments.py, which reuses agent.epsilon_greedy and the same update rules (a check confirms it reproduces agent.sarsa / agent.q_learning bit for bit) and uses 20 seeds where stated. Reproduction commands, seeds and versions are in README.md.</w:t>
+        <w:t xml:space="preserve"> are supplementary: they come from extra_experiments.py, which reuses agent.epsilon_greedy and the same update rules (a check confirms it reproduces agent.sarsa / agent.q_learning bit for bit) and uses 20 seeds where stated. The report figures are drawn by report_figures.py; reproduction commands, seeds and versions are in README.md.</w:t>
       </w:r>
     </w:p>
     <w:p>
@@ -118,7 +118,7 @@
                     <a:graphicData uri="http://schemas.openxmlformats.org/drawingml/2006/picture">
                       <pic:pic>
                         <pic:nvPicPr>
-                          <pic:cNvPr id="0" name="fig1_gridworld.png"/>
+                          <pic:cNvPr id="0" name="report_fig1_gridworld.png"/>
                           <pic:cNvPicPr/>
                         </pic:nvPicPr>
                         <pic:blipFill>
@@ -672,7 +672,7 @@
         <w:t>up</w:t>
       </w:r>
       <w:r>
-        <w:t xml:space="preserve"> policy drives most states into a wall or the top border forever, so their value is −1/(1−γ) = −20. Under a fixed policy the change per sweep shrinks only by γ = 0.95, and 0.95ᵏ⁻¹ &lt; 10⁻¹² gives exactly k = 540. Each improvement re-routes only the 4–7 states next to already-good ones, so some state keeps looping until round 6. From round 7 every path terminates, and evaluating a deterministic terminating policy is exact after 12 sweeps. Note that each evaluation starts from V = 0 (the initialisation convention). Warm-starting from the previous round's V would avoid recomputing the −20 of looping states from scratch, so the sweep total partly reflects this choice; the round count (9) does not, because each evaluation is run to the same fixed point.</w:t>
+        <w:t xml:space="preserve"> policy drives most states into a wall or the top border forever, so their value is −1/(1−γ) = −20. Under a fixed policy the change per sweep shrinks only by γ = 0.95, and 0.95ᵏ⁻¹ &lt; 10⁻¹² gives exactly k = 540. Each improvement re-routes only the 4–7 states next to already-good ones, so some state keeps looping until round 6. From round 7 every path terminates, and evaluating a deterministic terminating policy is exact after 12 sweeps. Each evaluation starts from V = 0; warm-starting from the previous V would lower the sweep total but not the 9 rounds, since every evaluation reaches the same fixed point.</w:t>
       </w:r>
     </w:p>
     <w:p>
@@ -753,7 +753,7 @@
               <a:graphicData uri="http://schemas.openxmlformats.org/drawingml/2006/picture">
                 <pic:pic>
                   <pic:nvPicPr>
-                    <pic:cNvPr id="0" name="fig2_paths.png"/>
+                    <pic:cNvPr id="0" name="report_fig2_paths.png"/>
                     <pic:cNvPicPr/>
                   </pic:nvPicPr>
                   <pic:blipFill>
@@ -805,7 +805,7 @@
         <w:rPr>
           <w:b/>
         </w:rPr>
-        <w:t>Why.</w:t>
+        <w:t>Why it leaves the edge.</w:t>
       </w:r>
       <w:r>
         <w:t xml:space="preserve"> Q-learning's target r + γ·max_a′ Q(s′,a′) assumes greedy behaviour from the next step on, so it estimates q*, the value of the optimal policy, whatever exploration is actually performed (Bellman optimality). SARSA's target r + γ·Q(s′,a′) uses the action the ε-greedy policy actually takes, so it estimates q_π of the ε-greedy policy itself (Bellman expectation). On row 3 every step has a 0.1 × ¼ = 2.5 % chance of a random </w:t>
@@ -817,21 +817,7 @@
         <w:t>down</w:t>
       </w:r>
       <w:r>
-        <w:t xml:space="preserve"> move: −75 and a restart at S. SARSA's values price that risk in; Q-learning's do not.</w:t>
-      </w:r>
-    </w:p>
-    <w:p>
-      <w:pPr>
-        <w:jc w:val="both"/>
-      </w:pPr>
-      <w:r>
-        <w:t xml:space="preserve">Figure 3 shows this directly. Averaged over row 3 (columns 1–8), SARSA's value is −14.6 while Q-learning's is −5.35, exactly V*. (Q-learning matches V* on rows 2–3 and at S; only the rarely visited rows 0–1 are still optimistic, by up to 2.4, because Q starts at 0.) SARSA values its top row (−11.5) above its edge row, so its greedy policy climbs. </w:t>
-      </w:r>
-      <w:r>
-        <w:rPr>
-          <w:b/>
-        </w:rPr>
-        <w:t>highest_row is therefore a direct readout of how much each method's objective is affected by its own exploration.</w:t>
+        <w:t xml:space="preserve"> move: −75 and a restart at S. SARSA's values price that risk in; Q-learning's do not. Figure 3 shows this: averaged over row 3 (columns 1–8), SARSA's value is −14.6 while Q-learning's is −5.35, exactly V*. (Q-learning matches V* on rows 2–3 and at S; only the rarely visited rows 0–1 are still optimistic, by up to 2.4, because Q starts at 0.)</w:t>
       </w:r>
     </w:p>
     <w:p>
@@ -852,7 +838,7 @@
               <a:graphicData uri="http://schemas.openxmlformats.org/drawingml/2006/picture">
                 <pic:pic>
                   <pic:nvPicPr>
-                    <pic:cNvPr id="0" name="fig3_value_maps.png"/>
+                    <pic:cNvPr id="0" name="report_fig3_value_maps.png"/>
                     <pic:cNvPicPr/>
                   </pic:nvPicPr>
                   <pic:blipFill>
@@ -894,6 +880,719 @@
           <w:sz w:val="17"/>
         </w:rPr>
         <w:t xml:space="preserve"> Learned values max_a Q̄(s,a) and greedy action argmax_a Q̄(s,a) of the seed-averaged Q̄ (seeds 0–4). SARSA's values drop sharply next to the cliff; Q-learning's equal V* along the edge.</w:t>
+      </w:r>
+    </w:p>
+    <w:p>
+      <w:pPr>
+        <w:jc w:val="both"/>
+      </w:pPr>
+      <w:r>
+        <w:rPr>
+          <w:b/>
+        </w:rPr>
+        <w:t>Why it goes as far as rows 0–1.</w:t>
+      </w:r>
+      <w:r>
+        <w:t xml:space="preserve"> The risk explains leaving the edge, but not the full detour. SARSA's convergence target, the fixed point q*_ε of its expected update under ε-greedy behaviour (solved exactly from the model), keeps only one row of distance at ε = 0.1: its greedy path runs along row 2 with return −13 (Table 4). The extra climb to rows 0–1 (−16.6) comes from the constant α = 0.5 and the finite budget. On the same 20 seeds, α = 0.1 learns q*_ε's row-2 path on every seed (−13.0). With α = 0.5 each update moves Q halfway towards a single sampled target, so values next to the cliff stay noisy and are repeatedly knocked down by single fall-driven samples, and the greedy policy keeps more distance than the expected risk justifies. </w:t>
+      </w:r>
+      <w:r>
+        <w:rPr>
+          <w:b/>
+        </w:rPr>
+        <w:t>highest_row therefore measures two things: the on-policy objective (row 3 → 2) and the step-size noise (row 2 → 0–1).</w:t>
+      </w:r>
+    </w:p>
+    <w:tbl>
+      <w:tblPr>
+        <w:tblW w:type="auto" w:w="0"/>
+        <w:jc w:val="center"/>
+        <w:tblLayout w:type="fixed"/>
+        <w:tblLook w:firstColumn="1" w:firstRow="1" w:lastColumn="0" w:lastRow="0" w:noHBand="0" w:noVBand="1" w:val="04A0"/>
+        <w:tblCellMar>
+          <w:top w:w="15" w:type="dxa"/>
+          <w:left w:w="70" w:type="dxa"/>
+          <w:bottom w:w="15" w:type="dxa"/>
+          <w:right w:w="70" w:type="dxa"/>
+        </w:tblCellMar>
+      </w:tblPr>
+      <w:tblGrid>
+        <w:gridCol w:w="1984"/>
+        <w:gridCol w:w="1984"/>
+        <w:gridCol w:w="1984"/>
+        <w:gridCol w:w="1984"/>
+        <w:gridCol w:w="1984"/>
+      </w:tblGrid>
+      <w:tr>
+        <w:trPr>
+          <w:cantSplit/>
+        </w:trPr>
+        <w:tc>
+          <w:tcPr>
+            <w:tcW w:type="dxa" w:w="648"/>
+            <w:tcBorders>
+              <w:top w:val="single" w:sz="8" w:color="8A8A8A"/>
+              <w:left w:val="nil"/>
+              <w:bottom w:val="single" w:sz="8" w:color="8A8A8A"/>
+              <w:right w:val="nil"/>
+            </w:tcBorders>
+          </w:tcPr>
+          <w:p>
+            <w:pPr>
+              <w:keepNext/>
+              <w:spacing w:after="0"/>
+              <w:jc w:val="left"/>
+            </w:pPr>
+            <w:r>
+              <w:rPr>
+                <w:b/>
+                <w:sz w:val="17"/>
+              </w:rPr>
+              <w:t>ε</w:t>
+            </w:r>
+          </w:p>
+        </w:tc>
+        <w:tc>
+          <w:tcPr>
+            <w:tcW w:type="dxa" w:w="1656"/>
+            <w:tcBorders>
+              <w:top w:val="single" w:sz="8" w:color="8A8A8A"/>
+              <w:left w:val="nil"/>
+              <w:bottom w:val="single" w:sz="8" w:color="8A8A8A"/>
+              <w:right w:val="nil"/>
+            </w:tcBorders>
+          </w:tcPr>
+          <w:p>
+            <w:pPr>
+              <w:keepNext/>
+              <w:spacing w:after="0"/>
+              <w:jc w:val="center"/>
+            </w:pPr>
+            <w:r>
+              <w:rPr>
+                <w:b/>
+                <w:sz w:val="17"/>
+              </w:rPr>
+              <w:t>q*_ε (exact)</w:t>
+            </w:r>
+          </w:p>
+        </w:tc>
+        <w:tc>
+          <w:tcPr>
+            <w:tcW w:type="dxa" w:w="2520"/>
+            <w:tcBorders>
+              <w:top w:val="single" w:sz="8" w:color="8A8A8A"/>
+              <w:left w:val="nil"/>
+              <w:bottom w:val="single" w:sz="8" w:color="8A8A8A"/>
+              <w:right w:val="nil"/>
+            </w:tcBorders>
+          </w:tcPr>
+          <w:p>
+            <w:pPr>
+              <w:keepNext/>
+              <w:spacing w:after="0"/>
+              <w:jc w:val="center"/>
+            </w:pPr>
+            <w:r>
+              <w:rPr>
+                <w:b/>
+                <w:sz w:val="17"/>
+              </w:rPr>
+              <w:t>α = 0.5 (spec)</w:t>
+            </w:r>
+          </w:p>
+        </w:tc>
+        <w:tc>
+          <w:tcPr>
+            <w:tcW w:type="dxa" w:w="2304"/>
+            <w:tcBorders>
+              <w:top w:val="single" w:sz="8" w:color="8A8A8A"/>
+              <w:left w:val="nil"/>
+              <w:bottom w:val="single" w:sz="8" w:color="8A8A8A"/>
+              <w:right w:val="nil"/>
+            </w:tcBorders>
+          </w:tcPr>
+          <w:p>
+            <w:pPr>
+              <w:keepNext/>
+              <w:spacing w:after="0"/>
+              <w:jc w:val="center"/>
+            </w:pPr>
+            <w:r>
+              <w:rPr>
+                <w:b/>
+                <w:sz w:val="17"/>
+              </w:rPr>
+              <w:t>α = 0.1</w:t>
+            </w:r>
+          </w:p>
+        </w:tc>
+        <w:tc>
+          <w:tcPr>
+            <w:tcW w:type="dxa" w:w="2520"/>
+            <w:tcBorders>
+              <w:top w:val="single" w:sz="8" w:color="8A8A8A"/>
+              <w:left w:val="nil"/>
+              <w:bottom w:val="single" w:sz="8" w:color="8A8A8A"/>
+              <w:right w:val="nil"/>
+            </w:tcBorders>
+          </w:tcPr>
+          <w:p>
+            <w:pPr>
+              <w:keepNext/>
+              <w:spacing w:after="0"/>
+              <w:jc w:val="center"/>
+            </w:pPr>
+            <w:r>
+              <w:rPr>
+                <w:b/>
+                <w:sz w:val="17"/>
+              </w:rPr>
+              <w:t>α = 0.5 / (1 + n/50)</w:t>
+            </w:r>
+          </w:p>
+        </w:tc>
+      </w:tr>
+      <w:tr>
+        <w:trPr>
+          <w:cantSplit/>
+        </w:trPr>
+        <w:tc>
+          <w:tcPr>
+            <w:tcW w:type="dxa" w:w="648"/>
+            <w:tcBorders>
+              <w:top w:val="nil"/>
+              <w:left w:val="nil"/>
+              <w:bottom w:val="nil"/>
+              <w:right w:val="nil"/>
+            </w:tcBorders>
+          </w:tcPr>
+          <w:p>
+            <w:pPr>
+              <w:keepNext/>
+              <w:spacing w:after="0"/>
+              <w:jc w:val="left"/>
+            </w:pPr>
+            <w:r>
+              <w:rPr>
+                <w:sz w:val="17"/>
+              </w:rPr>
+              <w:t>0.01</w:t>
+            </w:r>
+          </w:p>
+        </w:tc>
+        <w:tc>
+          <w:tcPr>
+            <w:tcW w:type="dxa" w:w="1656"/>
+            <w:tcBorders>
+              <w:top w:val="nil"/>
+              <w:left w:val="nil"/>
+              <w:bottom w:val="nil"/>
+              <w:right w:val="nil"/>
+            </w:tcBorders>
+          </w:tcPr>
+          <w:p>
+            <w:pPr>
+              <w:keepNext/>
+              <w:spacing w:after="0"/>
+              <w:jc w:val="center"/>
+            </w:pPr>
+            <w:r>
+              <w:rPr>
+                <w:sz w:val="17"/>
+              </w:rPr>
+              <w:t>row 3 · −11.0</w:t>
+            </w:r>
+          </w:p>
+        </w:tc>
+        <w:tc>
+          <w:tcPr>
+            <w:tcW w:type="dxa" w:w="2520"/>
+            <w:tcBorders>
+              <w:top w:val="nil"/>
+              <w:left w:val="nil"/>
+              <w:bottom w:val="nil"/>
+              <w:right w:val="nil"/>
+            </w:tcBorders>
+          </w:tcPr>
+          <w:p>
+            <w:pPr>
+              <w:keepNext/>
+              <w:spacing w:after="0"/>
+              <w:jc w:val="center"/>
+            </w:pPr>
+            <w:r>
+              <w:rPr>
+                <w:sz w:val="17"/>
+              </w:rPr>
+              <w:t>rows 0–1 · −16.1</w:t>
+            </w:r>
+          </w:p>
+        </w:tc>
+        <w:tc>
+          <w:tcPr>
+            <w:tcW w:type="dxa" w:w="2304"/>
+            <w:tcBorders>
+              <w:top w:val="nil"/>
+              <w:left w:val="nil"/>
+              <w:bottom w:val="nil"/>
+              <w:right w:val="nil"/>
+            </w:tcBorders>
+          </w:tcPr>
+          <w:p>
+            <w:pPr>
+              <w:keepNext/>
+              <w:spacing w:after="0"/>
+              <w:jc w:val="center"/>
+            </w:pPr>
+            <w:r>
+              <w:rPr>
+                <w:sz w:val="17"/>
+              </w:rPr>
+              <w:t>rows 2–3 · −12.9</w:t>
+            </w:r>
+          </w:p>
+        </w:tc>
+        <w:tc>
+          <w:tcPr>
+            <w:tcW w:type="dxa" w:w="2520"/>
+            <w:tcBorders>
+              <w:top w:val="nil"/>
+              <w:left w:val="nil"/>
+              <w:bottom w:val="nil"/>
+              <w:right w:val="nil"/>
+            </w:tcBorders>
+          </w:tcPr>
+          <w:p>
+            <w:pPr>
+              <w:keepNext/>
+              <w:spacing w:after="0"/>
+              <w:jc w:val="center"/>
+            </w:pPr>
+            <w:r>
+              <w:rPr>
+                <w:sz w:val="17"/>
+              </w:rPr>
+              <w:t>rows 1–2 · −13.2</w:t>
+            </w:r>
+          </w:p>
+        </w:tc>
+      </w:tr>
+      <w:tr>
+        <w:trPr>
+          <w:cantSplit/>
+        </w:trPr>
+        <w:tc>
+          <w:tcPr>
+            <w:tcW w:type="dxa" w:w="648"/>
+            <w:tcBorders>
+              <w:top w:val="nil"/>
+              <w:left w:val="nil"/>
+              <w:bottom w:val="nil"/>
+              <w:right w:val="nil"/>
+            </w:tcBorders>
+          </w:tcPr>
+          <w:p>
+            <w:pPr>
+              <w:keepNext/>
+              <w:spacing w:after="0"/>
+              <w:jc w:val="left"/>
+            </w:pPr>
+            <w:r>
+              <w:rPr>
+                <w:sz w:val="17"/>
+              </w:rPr>
+              <w:t>0.1</w:t>
+            </w:r>
+          </w:p>
+        </w:tc>
+        <w:tc>
+          <w:tcPr>
+            <w:tcW w:type="dxa" w:w="1656"/>
+            <w:tcBorders>
+              <w:top w:val="nil"/>
+              <w:left w:val="nil"/>
+              <w:bottom w:val="nil"/>
+              <w:right w:val="nil"/>
+            </w:tcBorders>
+          </w:tcPr>
+          <w:p>
+            <w:pPr>
+              <w:keepNext/>
+              <w:spacing w:after="0"/>
+              <w:jc w:val="center"/>
+            </w:pPr>
+            <w:r>
+              <w:rPr>
+                <w:sz w:val="17"/>
+              </w:rPr>
+              <w:t>row 2 · −13.0</w:t>
+            </w:r>
+          </w:p>
+        </w:tc>
+        <w:tc>
+          <w:tcPr>
+            <w:tcW w:type="dxa" w:w="2520"/>
+            <w:tcBorders>
+              <w:top w:val="nil"/>
+              <w:left w:val="nil"/>
+              <w:bottom w:val="nil"/>
+              <w:right w:val="nil"/>
+            </w:tcBorders>
+          </w:tcPr>
+          <w:p>
+            <w:pPr>
+              <w:keepNext/>
+              <w:spacing w:after="0"/>
+              <w:jc w:val="center"/>
+            </w:pPr>
+            <w:r>
+              <w:rPr>
+                <w:sz w:val="17"/>
+              </w:rPr>
+              <w:t xml:space="preserve">rows 0–1 · −15.8 · </w:t>
+            </w:r>
+            <w:r>
+              <w:rPr>
+                <w:b/>
+                <w:sz w:val="17"/>
+              </w:rPr>
+              <w:t>1 fail</w:t>
+            </w:r>
+          </w:p>
+        </w:tc>
+        <w:tc>
+          <w:tcPr>
+            <w:tcW w:type="dxa" w:w="2304"/>
+            <w:tcBorders>
+              <w:top w:val="nil"/>
+              <w:left w:val="nil"/>
+              <w:bottom w:val="nil"/>
+              <w:right w:val="nil"/>
+            </w:tcBorders>
+          </w:tcPr>
+          <w:p>
+            <w:pPr>
+              <w:keepNext/>
+              <w:spacing w:after="0"/>
+              <w:jc w:val="center"/>
+            </w:pPr>
+            <w:r>
+              <w:rPr>
+                <w:sz w:val="17"/>
+              </w:rPr>
+              <w:t>row 2 · −13.0</w:t>
+            </w:r>
+          </w:p>
+        </w:tc>
+        <w:tc>
+          <w:tcPr>
+            <w:tcW w:type="dxa" w:w="2520"/>
+            <w:tcBorders>
+              <w:top w:val="nil"/>
+              <w:left w:val="nil"/>
+              <w:bottom w:val="nil"/>
+              <w:right w:val="nil"/>
+            </w:tcBorders>
+          </w:tcPr>
+          <w:p>
+            <w:pPr>
+              <w:keepNext/>
+              <w:spacing w:after="0"/>
+              <w:jc w:val="center"/>
+            </w:pPr>
+            <w:r>
+              <w:rPr>
+                <w:sz w:val="17"/>
+              </w:rPr>
+              <w:t>rows 1–2 · −13.8</w:t>
+            </w:r>
+          </w:p>
+        </w:tc>
+      </w:tr>
+      <w:tr>
+        <w:trPr>
+          <w:cantSplit/>
+        </w:trPr>
+        <w:tc>
+          <w:tcPr>
+            <w:tcW w:type="dxa" w:w="648"/>
+            <w:tcBorders>
+              <w:top w:val="nil"/>
+              <w:left w:val="nil"/>
+              <w:bottom w:val="nil"/>
+              <w:right w:val="nil"/>
+            </w:tcBorders>
+          </w:tcPr>
+          <w:p>
+            <w:pPr>
+              <w:keepNext/>
+              <w:spacing w:after="0"/>
+              <w:jc w:val="left"/>
+            </w:pPr>
+            <w:r>
+              <w:rPr>
+                <w:sz w:val="17"/>
+              </w:rPr>
+              <w:t>0.2</w:t>
+            </w:r>
+          </w:p>
+        </w:tc>
+        <w:tc>
+          <w:tcPr>
+            <w:tcW w:type="dxa" w:w="1656"/>
+            <w:tcBorders>
+              <w:top w:val="nil"/>
+              <w:left w:val="nil"/>
+              <w:bottom w:val="nil"/>
+              <w:right w:val="nil"/>
+            </w:tcBorders>
+          </w:tcPr>
+          <w:p>
+            <w:pPr>
+              <w:keepNext/>
+              <w:spacing w:after="0"/>
+              <w:jc w:val="center"/>
+            </w:pPr>
+            <w:r>
+              <w:rPr>
+                <w:sz w:val="17"/>
+              </w:rPr>
+              <w:t>row 2 · −13.0</w:t>
+            </w:r>
+          </w:p>
+        </w:tc>
+        <w:tc>
+          <w:tcPr>
+            <w:tcW w:type="dxa" w:w="2520"/>
+            <w:tcBorders>
+              <w:top w:val="nil"/>
+              <w:left w:val="nil"/>
+              <w:bottom w:val="nil"/>
+              <w:right w:val="nil"/>
+            </w:tcBorders>
+          </w:tcPr>
+          <w:p>
+            <w:pPr>
+              <w:keepNext/>
+              <w:spacing w:after="0"/>
+              <w:jc w:val="center"/>
+            </w:pPr>
+            <w:r>
+              <w:rPr>
+                <w:sz w:val="17"/>
+              </w:rPr>
+              <w:t xml:space="preserve">rows 0–1 · −16.9 · </w:t>
+            </w:r>
+            <w:r>
+              <w:rPr>
+                <w:b/>
+                <w:sz w:val="17"/>
+              </w:rPr>
+              <w:t>1 fail</w:t>
+            </w:r>
+          </w:p>
+        </w:tc>
+        <w:tc>
+          <w:tcPr>
+            <w:tcW w:type="dxa" w:w="2304"/>
+            <w:tcBorders>
+              <w:top w:val="nil"/>
+              <w:left w:val="nil"/>
+              <w:bottom w:val="nil"/>
+              <w:right w:val="nil"/>
+            </w:tcBorders>
+          </w:tcPr>
+          <w:p>
+            <w:pPr>
+              <w:keepNext/>
+              <w:spacing w:after="0"/>
+              <w:jc w:val="center"/>
+            </w:pPr>
+            <w:r>
+              <w:rPr>
+                <w:sz w:val="17"/>
+              </w:rPr>
+              <w:t>rows 1–2 · −14.5</w:t>
+            </w:r>
+          </w:p>
+        </w:tc>
+        <w:tc>
+          <w:tcPr>
+            <w:tcW w:type="dxa" w:w="2520"/>
+            <w:tcBorders>
+              <w:top w:val="nil"/>
+              <w:left w:val="nil"/>
+              <w:bottom w:val="nil"/>
+              <w:right w:val="nil"/>
+            </w:tcBorders>
+          </w:tcPr>
+          <w:p>
+            <w:pPr>
+              <w:keepNext/>
+              <w:spacing w:after="0"/>
+              <w:jc w:val="center"/>
+            </w:pPr>
+            <w:r>
+              <w:rPr>
+                <w:sz w:val="17"/>
+              </w:rPr>
+              <w:t>row 1 · −15.0</w:t>
+            </w:r>
+          </w:p>
+        </w:tc>
+      </w:tr>
+      <w:tr>
+        <w:trPr>
+          <w:cantSplit/>
+        </w:trPr>
+        <w:tc>
+          <w:tcPr>
+            <w:tcW w:type="dxa" w:w="648"/>
+            <w:tcBorders>
+              <w:top w:val="nil"/>
+              <w:left w:val="nil"/>
+              <w:bottom w:val="single" w:sz="8" w:color="8A8A8A"/>
+              <w:right w:val="nil"/>
+            </w:tcBorders>
+          </w:tcPr>
+          <w:p>
+            <w:pPr>
+              <w:keepNext/>
+              <w:spacing w:after="0"/>
+              <w:jc w:val="left"/>
+            </w:pPr>
+            <w:r>
+              <w:rPr>
+                <w:sz w:val="17"/>
+              </w:rPr>
+              <w:t>0.3</w:t>
+            </w:r>
+          </w:p>
+        </w:tc>
+        <w:tc>
+          <w:tcPr>
+            <w:tcW w:type="dxa" w:w="1656"/>
+            <w:tcBorders>
+              <w:top w:val="nil"/>
+              <w:left w:val="nil"/>
+              <w:bottom w:val="single" w:sz="8" w:color="8A8A8A"/>
+              <w:right w:val="nil"/>
+            </w:tcBorders>
+          </w:tcPr>
+          <w:p>
+            <w:pPr>
+              <w:keepNext/>
+              <w:spacing w:after="0"/>
+              <w:jc w:val="center"/>
+            </w:pPr>
+            <w:r>
+              <w:rPr>
+                <w:sz w:val="17"/>
+              </w:rPr>
+              <w:t>row 1 · −15.0</w:t>
+            </w:r>
+          </w:p>
+        </w:tc>
+        <w:tc>
+          <w:tcPr>
+            <w:tcW w:type="dxa" w:w="2520"/>
+            <w:tcBorders>
+              <w:top w:val="nil"/>
+              <w:left w:val="nil"/>
+              <w:bottom w:val="single" w:sz="8" w:color="8A8A8A"/>
+              <w:right w:val="nil"/>
+            </w:tcBorders>
+          </w:tcPr>
+          <w:p>
+            <w:pPr>
+              <w:keepNext/>
+              <w:spacing w:after="0"/>
+              <w:jc w:val="center"/>
+            </w:pPr>
+            <w:r>
+              <w:rPr>
+                <w:sz w:val="17"/>
+              </w:rPr>
+              <w:t xml:space="preserve">rows 0–1 · −16.9 · </w:t>
+            </w:r>
+            <w:r>
+              <w:rPr>
+                <w:b/>
+                <w:sz w:val="17"/>
+              </w:rPr>
+              <w:t>5 fail</w:t>
+            </w:r>
+          </w:p>
+        </w:tc>
+        <w:tc>
+          <w:tcPr>
+            <w:tcW w:type="dxa" w:w="2304"/>
+            <w:tcBorders>
+              <w:top w:val="nil"/>
+              <w:left w:val="nil"/>
+              <w:bottom w:val="single" w:sz="8" w:color="8A8A8A"/>
+              <w:right w:val="nil"/>
+            </w:tcBorders>
+          </w:tcPr>
+          <w:p>
+            <w:pPr>
+              <w:keepNext/>
+              <w:spacing w:after="0"/>
+              <w:jc w:val="center"/>
+            </w:pPr>
+            <w:r>
+              <w:rPr>
+                <w:sz w:val="17"/>
+              </w:rPr>
+              <w:t>rows 0–2 · −15.1</w:t>
+            </w:r>
+          </w:p>
+        </w:tc>
+        <w:tc>
+          <w:tcPr>
+            <w:tcW w:type="dxa" w:w="2520"/>
+            <w:tcBorders>
+              <w:top w:val="nil"/>
+              <w:left w:val="nil"/>
+              <w:bottom w:val="single" w:sz="8" w:color="8A8A8A"/>
+              <w:right w:val="nil"/>
+            </w:tcBorders>
+          </w:tcPr>
+          <w:p>
+            <w:pPr>
+              <w:keepNext/>
+              <w:spacing w:after="0"/>
+              <w:jc w:val="center"/>
+            </w:pPr>
+            <w:r>
+              <w:rPr>
+                <w:sz w:val="17"/>
+              </w:rPr>
+              <w:t>row 1 · −15.0</w:t>
+            </w:r>
+          </w:p>
+        </w:tc>
+      </w:tr>
+    </w:tbl>
+    <w:p>
+      <w:pPr>
+        <w:spacing w:after="120"/>
+        <w:jc w:val="left"/>
+      </w:pPr>
+      <w:r>
+        <w:rPr>
+          <w:b/>
+          <w:color w:val="52514E"/>
+          <w:sz w:val="17"/>
+        </w:rPr>
+        <w:t>Table 4 [supp.].</w:t>
+      </w:r>
+      <w:r>
+        <w:rPr>
+          <w:color w:val="52514E"/>
+          <w:sz w:val="17"/>
+        </w:rPr>
+        <w:t xml:space="preserve"> SARSA's convergence target vs what it learns (20 seeds, 3,000 episodes). Each cell: highest row of the greedy path · greedy return (mean over runs that reach G) · number of the 20 final greedy policies that never reach G. q*_ε is the exact fixed point under ε-greedy behaviour; n is the visit count of (s, a).</w:t>
       </w:r>
     </w:p>
     <w:p>
@@ -945,7 +1644,7 @@
               <a:graphicData uri="http://schemas.openxmlformats.org/drawingml/2006/picture">
                 <pic:pic>
                   <pic:nvPicPr>
-                    <pic:cNvPr id="0" name="fig4_eps_sweep.png"/>
+                    <pic:cNvPr id="0" name="report_fig4_eps_sweep.png"/>
                     <pic:cNvPicPr/>
                   </pic:nvPicPr>
                   <pic:blipFill>
@@ -1003,11 +1702,12 @@
         </w:tblCellMar>
       </w:tblPr>
       <w:tblGrid>
-        <w:gridCol w:w="1984"/>
-        <w:gridCol w:w="1984"/>
-        <w:gridCol w:w="1984"/>
-        <w:gridCol w:w="1984"/>
-        <w:gridCol w:w="1984"/>
+        <w:gridCol w:w="1654"/>
+        <w:gridCol w:w="1654"/>
+        <w:gridCol w:w="1654"/>
+        <w:gridCol w:w="1654"/>
+        <w:gridCol w:w="1654"/>
+        <w:gridCol w:w="1654"/>
       </w:tblGrid>
       <w:tr>
         <w:trPr>
@@ -1015,7 +1715,7 @@
         </w:trPr>
         <w:tc>
           <w:tcPr>
-            <w:tcW w:type="dxa" w:w="648"/>
+            <w:tcW w:type="dxa" w:w="576"/>
             <w:tcBorders>
               <w:top w:val="single" w:sz="8" w:color="8A8A8A"/>
               <w:left w:val="nil"/>
@@ -1040,7 +1740,7 @@
         </w:tc>
         <w:tc>
           <w:tcPr>
-            <w:tcW w:type="dxa" w:w="2664"/>
+            <w:tcW w:type="dxa" w:w="2592"/>
             <w:tcBorders>
               <w:top w:val="single" w:sz="8" w:color="8A8A8A"/>
               <w:left w:val="nil"/>
@@ -1065,7 +1765,7 @@
         </w:tc>
         <w:tc>
           <w:tcPr>
-            <w:tcW w:type="dxa" w:w="2232"/>
+            <w:tcW w:type="dxa" w:w="1944"/>
             <w:tcBorders>
               <w:top w:val="single" w:sz="8" w:color="8A8A8A"/>
               <w:left w:val="nil"/>
@@ -1090,7 +1790,7 @@
         </w:tc>
         <w:tc>
           <w:tcPr>
-            <w:tcW w:type="dxa" w:w="2520"/>
+            <w:tcW w:type="dxa" w:w="1368"/>
             <w:tcBorders>
               <w:top w:val="single" w:sz="8" w:color="8A8A8A"/>
               <w:left w:val="nil"/>
@@ -1109,13 +1809,38 @@
                 <w:b/>
                 <w:sz w:val="17"/>
               </w:rPr>
-              <w:t>SARSA final greedy: reach G · return</w:t>
+              <w:t>SARSA greedy reaches G</w:t>
             </w:r>
           </w:p>
         </w:tc>
         <w:tc>
           <w:tcPr>
             <w:tcW w:type="dxa" w:w="1872"/>
+            <w:tcBorders>
+              <w:top w:val="single" w:sz="8" w:color="8A8A8A"/>
+              <w:left w:val="nil"/>
+              <w:bottom w:val="single" w:sz="8" w:color="8A8A8A"/>
+              <w:right w:val="nil"/>
+            </w:tcBorders>
+          </w:tcPr>
+          <w:p>
+            <w:pPr>
+              <w:keepNext/>
+              <w:spacing w:after="0"/>
+              <w:jc w:val="center"/>
+            </w:pPr>
+            <w:r>
+              <w:rPr>
+                <w:b/>
+                <w:sz w:val="17"/>
+              </w:rPr>
+              <w:t>SARSA greedy return: reached / all</w:t>
+            </w:r>
+          </w:p>
+        </w:tc>
+        <w:tc>
+          <w:tcPr>
+            <w:tcW w:type="dxa" w:w="1584"/>
             <w:tcBorders>
               <w:top w:val="single" w:sz="8" w:color="8A8A8A"/>
               <w:left w:val="nil"/>
@@ -1145,7 +1870,7 @@
         </w:trPr>
         <w:tc>
           <w:tcPr>
-            <w:tcW w:type="dxa" w:w="648"/>
+            <w:tcW w:type="dxa" w:w="576"/>
             <w:tcBorders>
               <w:top w:val="nil"/>
               <w:left w:val="nil"/>
@@ -1169,7 +1894,7 @@
         </w:tc>
         <w:tc>
           <w:tcPr>
-            <w:tcW w:type="dxa" w:w="2664"/>
+            <w:tcW w:type="dxa" w:w="2592"/>
             <w:tcBorders>
               <w:top w:val="nil"/>
               <w:left w:val="nil"/>
@@ -1200,7 +1925,7 @@
         </w:tc>
         <w:tc>
           <w:tcPr>
-            <w:tcW w:type="dxa" w:w="2232"/>
+            <w:tcW w:type="dxa" w:w="1944"/>
             <w:tcBorders>
               <w:top w:val="nil"/>
               <w:left w:val="nil"/>
@@ -1224,7 +1949,7 @@
         </w:tc>
         <w:tc>
           <w:tcPr>
-            <w:tcW w:type="dxa" w:w="2520"/>
+            <w:tcW w:type="dxa" w:w="1368"/>
             <w:tcBorders>
               <w:top w:val="nil"/>
               <w:left w:val="nil"/>
@@ -1242,13 +1967,37 @@
               <w:rPr>
                 <w:sz w:val="17"/>
               </w:rPr>
-              <w:t>20/20 · −16.1</w:t>
+              <w:t>20/20</w:t>
             </w:r>
           </w:p>
         </w:tc>
         <w:tc>
           <w:tcPr>
             <w:tcW w:type="dxa" w:w="1872"/>
+            <w:tcBorders>
+              <w:top w:val="nil"/>
+              <w:left w:val="nil"/>
+              <w:bottom w:val="nil"/>
+              <w:right w:val="nil"/>
+            </w:tcBorders>
+          </w:tcPr>
+          <w:p>
+            <w:pPr>
+              <w:keepNext/>
+              <w:spacing w:after="0"/>
+              <w:jc w:val="center"/>
+            </w:pPr>
+            <w:r>
+              <w:rPr>
+                <w:sz w:val="17"/>
+              </w:rPr>
+              <w:t>−16.1 / −16.1</w:t>
+            </w:r>
+          </w:p>
+        </w:tc>
+        <w:tc>
+          <w:tcPr>
+            <w:tcW w:type="dxa" w:w="1584"/>
             <w:tcBorders>
               <w:top w:val="nil"/>
               <w:left w:val="nil"/>
@@ -1277,7 +2026,7 @@
         </w:trPr>
         <w:tc>
           <w:tcPr>
-            <w:tcW w:type="dxa" w:w="648"/>
+            <w:tcW w:type="dxa" w:w="576"/>
             <w:tcBorders>
               <w:top w:val="nil"/>
               <w:left w:val="nil"/>
@@ -1301,7 +2050,7 @@
         </w:tc>
         <w:tc>
           <w:tcPr>
-            <w:tcW w:type="dxa" w:w="2664"/>
+            <w:tcW w:type="dxa" w:w="2592"/>
             <w:tcBorders>
               <w:top w:val="nil"/>
               <w:left w:val="nil"/>
@@ -1332,7 +2081,7 @@
         </w:tc>
         <w:tc>
           <w:tcPr>
-            <w:tcW w:type="dxa" w:w="2232"/>
+            <w:tcW w:type="dxa" w:w="1944"/>
             <w:tcBorders>
               <w:top w:val="nil"/>
               <w:left w:val="nil"/>
@@ -1350,13 +2099,13 @@
               <w:rPr>
                 <w:sz w:val="17"/>
               </w:rPr>
-              <w:t>2.4 % / 10.7 %</w:t>
+              <w:t>1.9 % / 10.7 %</w:t>
             </w:r>
           </w:p>
         </w:tc>
         <w:tc>
           <w:tcPr>
-            <w:tcW w:type="dxa" w:w="2520"/>
+            <w:tcW w:type="dxa" w:w="1368"/>
             <w:tcBorders>
               <w:top w:val="nil"/>
               <w:left w:val="nil"/>
@@ -1374,13 +2123,37 @@
               <w:rPr>
                 <w:sz w:val="17"/>
               </w:rPr>
-              <w:t>20/20 · −16.3</w:t>
+              <w:t>20/20</w:t>
             </w:r>
           </w:p>
         </w:tc>
         <w:tc>
           <w:tcPr>
             <w:tcW w:type="dxa" w:w="1872"/>
+            <w:tcBorders>
+              <w:top w:val="nil"/>
+              <w:left w:val="nil"/>
+              <w:bottom w:val="nil"/>
+              <w:right w:val="nil"/>
+            </w:tcBorders>
+          </w:tcPr>
+          <w:p>
+            <w:pPr>
+              <w:keepNext/>
+              <w:spacing w:after="0"/>
+              <w:jc w:val="center"/>
+            </w:pPr>
+            <w:r>
+              <w:rPr>
+                <w:sz w:val="17"/>
+              </w:rPr>
+              <w:t>−16.3 / −16.3</w:t>
+            </w:r>
+          </w:p>
+        </w:tc>
+        <w:tc>
+          <w:tcPr>
+            <w:tcW w:type="dxa" w:w="1584"/>
             <w:tcBorders>
               <w:top w:val="nil"/>
               <w:left w:val="nil"/>
@@ -1409,7 +2182,7 @@
         </w:trPr>
         <w:tc>
           <w:tcPr>
-            <w:tcW w:type="dxa" w:w="648"/>
+            <w:tcW w:type="dxa" w:w="576"/>
             <w:tcBorders>
               <w:top w:val="nil"/>
               <w:left w:val="nil"/>
@@ -1433,7 +2206,7 @@
         </w:tc>
         <w:tc>
           <w:tcPr>
-            <w:tcW w:type="dxa" w:w="2664"/>
+            <w:tcW w:type="dxa" w:w="2592"/>
             <w:tcBorders>
               <w:top w:val="nil"/>
               <w:left w:val="nil"/>
@@ -1464,7 +2237,7 @@
         </w:tc>
         <w:tc>
           <w:tcPr>
-            <w:tcW w:type="dxa" w:w="2232"/>
+            <w:tcW w:type="dxa" w:w="1944"/>
             <w:tcBorders>
               <w:top w:val="nil"/>
               <w:left w:val="nil"/>
@@ -1482,13 +2255,13 @@
               <w:rPr>
                 <w:sz w:val="17"/>
               </w:rPr>
-              <w:t>4.6 % / 19.8 %</w:t>
+              <w:t>3.9 % / 19.8 %</w:t>
             </w:r>
           </w:p>
         </w:tc>
         <w:tc>
           <w:tcPr>
-            <w:tcW w:type="dxa" w:w="2520"/>
+            <w:tcW w:type="dxa" w:w="1368"/>
             <w:tcBorders>
               <w:top w:val="nil"/>
               <w:left w:val="nil"/>
@@ -1506,13 +2279,37 @@
               <w:rPr>
                 <w:sz w:val="17"/>
               </w:rPr>
-              <w:t>19/20 · −15.8</w:t>
+              <w:t>19/20</w:t>
             </w:r>
           </w:p>
         </w:tc>
         <w:tc>
           <w:tcPr>
             <w:tcW w:type="dxa" w:w="1872"/>
+            <w:tcBorders>
+              <w:top w:val="nil"/>
+              <w:left w:val="nil"/>
+              <w:bottom w:val="nil"/>
+              <w:right w:val="nil"/>
+            </w:tcBorders>
+          </w:tcPr>
+          <w:p>
+            <w:pPr>
+              <w:keepNext/>
+              <w:spacing w:after="0"/>
+              <w:jc w:val="center"/>
+            </w:pPr>
+            <w:r>
+              <w:rPr>
+                <w:sz w:val="17"/>
+              </w:rPr>
+              <w:t>−15.8 / −35.0</w:t>
+            </w:r>
+          </w:p>
+        </w:tc>
+        <w:tc>
+          <w:tcPr>
+            <w:tcW w:type="dxa" w:w="1584"/>
             <w:tcBorders>
               <w:top w:val="nil"/>
               <w:left w:val="nil"/>
@@ -1541,7 +2338,7 @@
         </w:trPr>
         <w:tc>
           <w:tcPr>
-            <w:tcW w:type="dxa" w:w="648"/>
+            <w:tcW w:type="dxa" w:w="576"/>
             <w:tcBorders>
               <w:top w:val="nil"/>
               <w:left w:val="nil"/>
@@ -1565,7 +2362,7 @@
         </w:tc>
         <w:tc>
           <w:tcPr>
-            <w:tcW w:type="dxa" w:w="2664"/>
+            <w:tcW w:type="dxa" w:w="2592"/>
             <w:tcBorders>
               <w:top w:val="nil"/>
               <w:left w:val="nil"/>
@@ -1596,7 +2393,7 @@
         </w:tc>
         <w:tc>
           <w:tcPr>
-            <w:tcW w:type="dxa" w:w="2232"/>
+            <w:tcW w:type="dxa" w:w="1944"/>
             <w:tcBorders>
               <w:top w:val="nil"/>
               <w:left w:val="nil"/>
@@ -1614,13 +2411,13 @@
               <w:rPr>
                 <w:sz w:val="17"/>
               </w:rPr>
-              <w:t>10.7 % / 34.6 %</w:t>
+              <w:t>9.1 % / 34.6 %</w:t>
             </w:r>
           </w:p>
         </w:tc>
         <w:tc>
           <w:tcPr>
-            <w:tcW w:type="dxa" w:w="2520"/>
+            <w:tcW w:type="dxa" w:w="1368"/>
             <w:tcBorders>
               <w:top w:val="nil"/>
               <w:left w:val="nil"/>
@@ -1638,13 +2435,37 @@
               <w:rPr>
                 <w:sz w:val="17"/>
               </w:rPr>
-              <w:t>19/20 · −16.9</w:t>
+              <w:t>19/20</w:t>
             </w:r>
           </w:p>
         </w:tc>
         <w:tc>
           <w:tcPr>
             <w:tcW w:type="dxa" w:w="1872"/>
+            <w:tcBorders>
+              <w:top w:val="nil"/>
+              <w:left w:val="nil"/>
+              <w:bottom w:val="nil"/>
+              <w:right w:val="nil"/>
+            </w:tcBorders>
+          </w:tcPr>
+          <w:p>
+            <w:pPr>
+              <w:keepNext/>
+              <w:spacing w:after="0"/>
+              <w:jc w:val="center"/>
+            </w:pPr>
+            <w:r>
+              <w:rPr>
+                <w:sz w:val="17"/>
+              </w:rPr>
+              <w:t>−16.9 / −36.0</w:t>
+            </w:r>
+          </w:p>
+        </w:tc>
+        <w:tc>
+          <w:tcPr>
+            <w:tcW w:type="dxa" w:w="1584"/>
             <w:tcBorders>
               <w:top w:val="nil"/>
               <w:left w:val="nil"/>
@@ -1673,7 +2494,7 @@
         </w:trPr>
         <w:tc>
           <w:tcPr>
-            <w:tcW w:type="dxa" w:w="648"/>
+            <w:tcW w:type="dxa" w:w="576"/>
             <w:tcBorders>
               <w:top w:val="nil"/>
               <w:left w:val="nil"/>
@@ -1697,7 +2518,7 @@
         </w:tc>
         <w:tc>
           <w:tcPr>
-            <w:tcW w:type="dxa" w:w="2664"/>
+            <w:tcW w:type="dxa" w:w="2592"/>
             <w:tcBorders>
               <w:top w:val="nil"/>
               <w:left w:val="nil"/>
@@ -1728,7 +2549,7 @@
         </w:tc>
         <w:tc>
           <w:tcPr>
-            <w:tcW w:type="dxa" w:w="2232"/>
+            <w:tcW w:type="dxa" w:w="1944"/>
             <w:tcBorders>
               <w:top w:val="nil"/>
               <w:left w:val="nil"/>
@@ -1746,13 +2567,13 @@
               <w:rPr>
                 <w:sz w:val="17"/>
               </w:rPr>
-              <w:t>18.2 % / 46.5 %</w:t>
+              <w:t>15.6 % / 46.5 %</w:t>
             </w:r>
           </w:p>
         </w:tc>
         <w:tc>
           <w:tcPr>
-            <w:tcW w:type="dxa" w:w="2520"/>
+            <w:tcW w:type="dxa" w:w="1368"/>
             <w:tcBorders>
               <w:top w:val="nil"/>
               <w:left w:val="nil"/>
@@ -1770,13 +2591,37 @@
               <w:rPr>
                 <w:sz w:val="17"/>
               </w:rPr>
-              <w:t>15/20 · −16.9</w:t>
+              <w:t>15/20</w:t>
             </w:r>
           </w:p>
         </w:tc>
         <w:tc>
           <w:tcPr>
             <w:tcW w:type="dxa" w:w="1872"/>
+            <w:tcBorders>
+              <w:top w:val="nil"/>
+              <w:left w:val="nil"/>
+              <w:bottom w:val="single" w:sz="8" w:color="8A8A8A"/>
+              <w:right w:val="nil"/>
+            </w:tcBorders>
+          </w:tcPr>
+          <w:p>
+            <w:pPr>
+              <w:keepNext/>
+              <w:spacing w:after="0"/>
+              <w:jc w:val="center"/>
+            </w:pPr>
+            <w:r>
+              <w:rPr>
+                <w:sz w:val="17"/>
+              </w:rPr>
+              <w:t>−16.9 / −112.7</w:t>
+            </w:r>
+          </w:p>
+        </w:tc>
+        <w:tc>
+          <w:tcPr>
+            <w:tcW w:type="dxa" w:w="1584"/>
             <w:tcBorders>
               <w:top w:val="nil"/>
               <w:left w:val="nil"/>
@@ -1818,7 +2663,7 @@
           <w:color w:val="52514E"/>
           <w:sz w:val="17"/>
         </w:rPr>
-        <w:t xml:space="preserve"> 20 seeds, mean ± std; S = SARSA, Q = Q-learning; bold = better training return. SARSA's final greedy return is averaged over the runs that reach G only (a failed run has no finite return), so it is conditional on success. Q-learning reaches G on 20/20 seeds with return −11 and in 100 % of snapshots at every ε.</w:t>
+        <w:t xml:space="preserve"> 20 seeds, mean ± std; S = SARSA, Q = Q-learning; bold = better training return. Falls: share of the last 500 training episodes with at least one cliff transition (reward −75). SARSA's greedy return is given over the runs that reach G and over all 20 runs, where a policy that never reaches G scores −400 at the 400-step cap. Q-learning reaches G on 20/20 seeds with return −11 and in 100 % of snapshots at every ε.</w:t>
       </w:r>
     </w:p>
     <w:p>
@@ -1832,7 +2677,7 @@
         <w:t>Exploration and training return.</w:t>
       </w:r>
       <w:r>
-        <w:t xml:space="preserve"> Larger ε means more random moves and more falls, but the cost depends on where the agent walks. On the edge, Q-learning falls in 2.3 % → 46.5 % of episodes as ε goes from 0.01 to 0.3; SARSA, away from the edge, in 0.2 % → 18.2 %. Training return drops for both, much faster for Q-learning (−13.0 → −85.5 vs −16.5 → −46.6), and the ranking reverses: Q-learning trains better at ε = 0.01, they are level at 0.05, and SARSA is better from 0.1 on.</w:t>
+        <w:t xml:space="preserve"> Larger ε means more random moves and more falls, but the cost depends on where the agent walks. On the edge, Q-learning falls in 2.3 % → 46.5 % of episodes as ε goes from 0.01 to 0.3; SARSA, away from the edge, in 0.2 % → 15.6 %. Training return drops for both, much faster for Q-learning (−13.0 → −85.5 vs −16.5 → −46.6), and the ranking reverses: Q-learning trains better at ε = 0.01, they are level at 0.05, and SARSA is better from 0.1 on.</w:t>
       </w:r>
     </w:p>
     <w:p>
@@ -1846,7 +2691,7 @@
         <w:t>Final greedy evaluation.</w:t>
       </w:r>
       <w:r>
-        <w:t xml:space="preserve"> Q-learning's greedy policy is optimal (−11) at every ε and seed, because its target does not depend on ε. SARSA's greedy path stays on the detour at every ε and becomes less reliable as ε grows: the share of late snapshots whose greedy policy reaches G falls from 98.6 % to 60.6 %, and at ε = 0.3, 5 of 20 final policies never reach G.</w:t>
+        <w:t xml:space="preserve"> Q-learning's greedy policy is optimal (−11) at every ε and seed, because its target does not depend on ε. SARSA's greedy path stays on the detour at every ε and becomes less reliable as ε grows: the share of late snapshots whose greedy policy reaches G falls from 98.6 % to 60.6 %. At ε = 0.3, 5 of 20 final policies never reach G, which pulls the all-seed mean (capped at 400 steps) to −112.7 although the successful runs average −16.9.</w:t>
       </w:r>
     </w:p>
     <w:p>
@@ -1878,7 +2723,7 @@
         <w:t>down</w:t>
       </w:r>
       <w:r>
-        <w:t xml:space="preserve"> bumps the border, so the greedy agent never leaves S; the ε-greedy behaviour escapes such loops, so training is unaffected. Q-learning, whose target is deterministic here, never fails, and all five graded SARSA runs (ε = 0.1, results.json) reach G.</w:t>
+        <w:t xml:space="preserve"> bumps the border, so the greedy agent never leaves S; the ε-greedy behaviour escapes such loops, so training is unaffected. Table 4 confirms the diagnosis: q*_ε reaches G at every ε, and on the same 20 seeds α = 0.1 or a decaying α gives no failures at any ε (late-snapshot stability 98–100 %). Q-learning, whose target has no sampled action, never fails, and all five graded SARSA runs (ε = 0.1, results.json) reach G.</w:t>
       </w:r>
     </w:p>
     <w:p>
@@ -1892,7 +2737,7 @@
         <w:t>Too little exploration also has a cost.</w:t>
       </w:r>
       <w:r>
-        <w:t xml:space="preserve"> At ε = 0.01 the edge path is nearly the best choice even for SARSA's own objective: executed with ε = 0.01, the edge path earns −12.8 against −17.0 for SARSA's detour (Figure 6). Yet SARSA does not find it. Even in a 20,000-episode run at ε = 0.01 [supp.] its greedy path only drifts from row 0 to rows 1–2. Early episodes, with Q initialised at 0, fall off the cliff often, so edge actions start with very negative values; with ε = 0.01 they are almost never retried, and those estimates are not corrected. In short, </w:t>
+        <w:t xml:space="preserve"> At ε = 0.01 the edge is optimal even for SARSA's own objective (q*_ε runs along row 3, Table 4), yet SARSA rarely finds it: 1 of 20 runs with α = 0.1, none with α = 0.5. In a 20,000-episode run at ε = 0.01 [supp.] its greedy path only drifts from row 0 to rows 1–2. Early episodes, with Q initialised at 0, fall off the cliff often, so edge actions start with very negative values; with ε = 0.01 they are almost never retried, and those estimates are not corrected. In short, </w:t>
       </w:r>
       <w:r>
         <w:rPr>
@@ -1984,7 +2829,7 @@
                     <a:graphicData uri="http://schemas.openxmlformats.org/drawingml/2006/picture">
                       <pic:pic>
                         <pic:nvPicPr>
-                          <pic:cNvPr id="0" name="fig5_training_curves.png"/>
+                          <pic:cNvPr id="0" name="report_fig5_training_curves.png"/>
                           <pic:cNvPicPr/>
                         </pic:nvPicPr>
                         <pic:blipFill>
@@ -2577,7 +3422,7 @@
               <a:graphicData uri="http://schemas.openxmlformats.org/drawingml/2006/picture">
                 <pic:pic>
                   <pic:nvPicPr>
-                    <pic:cNvPr id="0" name="fig6_cross_eval.png"/>
+                    <pic:cNvPr id="0" name="report_fig6_cross_eval.png"/>
                     <pic:cNvPicPr/>
                   </pic:nvPicPr>
                   <pic:blipFill>
@@ -2696,7 +3541,7 @@
         <w:t>On- vs off-policy:</w:t>
       </w:r>
       <w:r>
-        <w:t xml:space="preserve"> Q-learning learns q* and the edge path (highest_row 3.0, return −11). SARSA learns the value of its ε-greedy behaviour, prices in the 2.5 % per-step fall risk and detours (highest_row 0.2, return −16.6).</w:t>
+        <w:t xml:space="preserve"> Q-learning learns q* and the edge path (highest_row 3.0, return −11). SARSA learns the value of its ε-greedy behaviour and prices in the 2.5 % per-step fall risk; that alone moves it one row up (q*_ε: row 2, −13), and the constant α = 0.5 adds the rest (highest_row 0.2, return −16.6).</w:t>
       </w:r>
     </w:p>
     <w:p>
@@ -2712,7 +3557,7 @@
         <w:t>ε:</w:t>
       </w:r>
       <w:r>
-        <w:t xml:space="preserve"> higher ε raises falls and lowers training return, far more for Q-learning, and makes SARSA's greedy policy less reliable (98.6 % → 60.6 %). Very small ε reverses the training-return ranking and starves SARSA of the exploration it needs to revise early estimates.</w:t>
+        <w:t xml:space="preserve"> higher ε raises falls and lowers training return, far more for Q-learning, and makes SARSA's greedy policy less reliable (98.6 % → 60.6 %), a step-size effect that vanishes with α = 0.1. Very small ε reverses the training-return ranking and starves SARSA of the exploration it needs to revise early estimates.</w:t>
       </w:r>
     </w:p>
     <w:p>

</xml_diff>